<commit_message>
test plan updates and python adjustments
updated 6780 test plan and made some filepath changes to the python scripts. Also added configuration commands via ace to the pyython code
</commit_message>
<xml_diff>
--- a/Test Plans/ADRF6780.docx
+++ b/Test Plans/ADRF6780.docx
@@ -76,6 +76,9 @@
     </w:p>
     <w:p>
       <w:r>
+        <w:rPr>
+          <w:noProof/>
+        </w:rPr>
         <w:drawing>
           <wp:inline distT="0" distB="0" distL="0" distR="0" wp14:anchorId="2E972294" wp14:editId="1A9637FA">
             <wp:extent cx="6876796" cy="3752850"/>
@@ -707,7 +710,16 @@
           </w:tcPr>
           <w:p>
             <w:r>
+              <w:rPr>
+                <w:highlight w:val="red"/>
+              </w:rPr>
               <w:t>~17.5mA</w:t>
+            </w:r>
+            <w:r>
+              <w:t xml:space="preserve"> was 300mA on board </w:t>
+            </w:r>
+            <w:r>
+              <w:t>1</w:t>
             </w:r>
           </w:p>
         </w:tc>

</xml_diff>